<commit_message>
Read line breaks, column alignment, box sides, double brackets and any math prefix in Word equations
A manual line break (m:brk) in a display equation now starts a new line:
multlined, or aligned on the operator m:alnAt names. Matrix column
alignment (m:mcJc) becomes matrix* or an array with a column spec. A border
box with some sides hidden, or a horizontal or vertical strike, draws just
those through \enclose. Double brackets are two close brackets that grow
with their content. Equations are found and read by the math namespace URI,
so a prefix other than m: (or the default namespace) works too.
</commit_message>
<xml_diff>
--- a/tests/corpus/treasurer-equations.docx
+++ b/tests/corpus/treasurer-equations.docx
@@ -2229,6 +2229,449 @@
     </w:p>
     <w:p>
       <w:r>
+        <w:t xml:space="preserve">A long total broken over three lines, and one broken at its equals sign:</w:t>
+      </w:r>
+    </w:p>
+    <w:p>
+      <m:oMathPara>
+        <m:oMathParaPr>
+          <m:jc m:val="center"/>
+        </m:oMathParaPr>
+        <m:oMath>
+          <m:r>
+            <w:rPr>
+              <w:rFonts w:ascii="Cambria Math" w:hAnsi="Cambria Math"/>
+            </w:rPr>
+            <m:t xml:space="preserve">T=</m:t>
+          </m:r>
+          <m:sSub>
+            <m:e>
+              <m:r>
+                <w:rPr>
+                  <w:rFonts w:ascii="Cambria Math" w:hAnsi="Cambria Math"/>
+                </w:rPr>
+                <m:t xml:space="preserve">f</m:t>
+              </m:r>
+            </m:e>
+            <m:sub>
+              <m:r>
+                <w:rPr>
+                  <w:rFonts w:ascii="Cambria Math" w:hAnsi="Cambria Math"/>
+                </w:rPr>
+                <m:t xml:space="preserve">1</m:t>
+              </m:r>
+            </m:sub>
+          </m:sSub>
+          <m:r>
+            <w:rPr>
+              <w:rFonts w:ascii="Cambria Math" w:hAnsi="Cambria Math"/>
+            </w:rPr>
+            <m:t xml:space="preserve">+</m:t>
+          </m:r>
+          <m:sSub>
+            <m:e>
+              <m:r>
+                <w:rPr>
+                  <w:rFonts w:ascii="Cambria Math" w:hAnsi="Cambria Math"/>
+                </w:rPr>
+                <m:t xml:space="preserve">f</m:t>
+              </m:r>
+            </m:e>
+            <m:sub>
+              <m:r>
+                <w:rPr>
+                  <w:rFonts w:ascii="Cambria Math" w:hAnsi="Cambria Math"/>
+                </w:rPr>
+                <m:t xml:space="preserve">2</m:t>
+              </m:r>
+            </m:sub>
+          </m:sSub>
+          <m:r>
+            <m:rPr>
+              <m:brk/>
+            </m:rPr>
+            <w:rPr>
+              <w:rFonts w:ascii="Cambria Math" w:hAnsi="Cambria Math"/>
+            </w:rPr>
+            <m:t xml:space="preserve">+</m:t>
+          </m:r>
+          <m:sSub>
+            <m:e>
+              <m:r>
+                <w:rPr>
+                  <w:rFonts w:ascii="Cambria Math" w:hAnsi="Cambria Math"/>
+                </w:rPr>
+                <m:t xml:space="preserve">f</m:t>
+              </m:r>
+            </m:e>
+            <m:sub>
+              <m:r>
+                <w:rPr>
+                  <w:rFonts w:ascii="Cambria Math" w:hAnsi="Cambria Math"/>
+                </w:rPr>
+                <m:t xml:space="preserve">3</m:t>
+              </m:r>
+            </m:sub>
+          </m:sSub>
+          <m:r>
+            <w:rPr>
+              <w:rFonts w:ascii="Cambria Math" w:hAnsi="Cambria Math"/>
+            </w:rPr>
+            <m:t xml:space="preserve">+</m:t>
+          </m:r>
+          <m:sSub>
+            <m:e>
+              <m:r>
+                <w:rPr>
+                  <w:rFonts w:ascii="Cambria Math" w:hAnsi="Cambria Math"/>
+                </w:rPr>
+                <m:t xml:space="preserve">f</m:t>
+              </m:r>
+            </m:e>
+            <m:sub>
+              <m:r>
+                <w:rPr>
+                  <w:rFonts w:ascii="Cambria Math" w:hAnsi="Cambria Math"/>
+                </w:rPr>
+                <m:t xml:space="preserve">4</m:t>
+              </m:r>
+            </m:sub>
+          </m:sSub>
+          <m:r>
+            <m:rPr>
+              <m:brk/>
+            </m:rPr>
+            <w:rPr>
+              <w:rFonts w:ascii="Cambria Math" w:hAnsi="Cambria Math"/>
+            </w:rPr>
+            <m:t xml:space="preserve">+</m:t>
+          </m:r>
+          <m:sSub>
+            <m:e>
+              <m:r>
+                <w:rPr>
+                  <w:rFonts w:ascii="Cambria Math" w:hAnsi="Cambria Math"/>
+                </w:rPr>
+                <m:t xml:space="preserve">f</m:t>
+              </m:r>
+            </m:e>
+            <m:sub>
+              <m:r>
+                <w:rPr>
+                  <w:rFonts w:ascii="Cambria Math" w:hAnsi="Cambria Math"/>
+                </w:rPr>
+                <m:t xml:space="preserve">5</m:t>
+              </m:r>
+            </m:sub>
+          </m:sSub>
+        </m:oMath>
+      </m:oMathPara>
+    </w:p>
+    <w:p>
+      <m:oMathPara>
+        <m:oMathParaPr>
+          <m:jc m:val="center"/>
+        </m:oMathParaPr>
+        <m:oMath>
+          <m:r>
+            <w:rPr>
+              <w:rFonts w:ascii="Cambria Math" w:hAnsi="Cambria Math"/>
+            </w:rPr>
+            <m:t xml:space="preserve">S=</m:t>
+          </m:r>
+          <m:f>
+            <m:num>
+              <m:r>
+                <w:rPr>
+                  <w:rFonts w:ascii="Cambria Math" w:hAnsi="Cambria Math"/>
+                </w:rPr>
+                <m:t xml:space="preserve">a</m:t>
+              </m:r>
+            </m:num>
+            <m:den>
+              <m:r>
+                <w:rPr>
+                  <w:rFonts w:ascii="Cambria Math" w:hAnsi="Cambria Math"/>
+                </w:rPr>
+                <m:t xml:space="preserve">2</m:t>
+              </m:r>
+            </m:den>
+          </m:f>
+          <m:r>
+            <m:rPr>
+              <m:brk m:alnAt="1"/>
+            </m:rPr>
+            <w:rPr>
+              <w:rFonts w:ascii="Cambria Math" w:hAnsi="Cambria Math"/>
+            </w:rPr>
+            <m:t xml:space="preserve">+b</m:t>
+          </m:r>
+          <m:r>
+            <m:rPr>
+              <m:brk m:alnAt="1"/>
+            </m:rPr>
+            <w:rPr>
+              <w:rFonts w:ascii="Cambria Math" w:hAnsi="Cambria Math"/>
+            </w:rPr>
+            <m:t xml:space="preserve">+c</m:t>
+          </m:r>
+        </m:oMath>
+      </m:oMathPara>
+    </w:p>
+    <w:p>
+      <w:r>
+        <w:t xml:space="preserve">A grid with its first column on the left and its second on the right, and one with every column on the right:</w:t>
+      </w:r>
+    </w:p>
+    <w:p>
+      <m:oMathPara>
+        <m:oMathParaPr>
+          <m:jc m:val="center"/>
+        </m:oMathParaPr>
+        <m:oMath>
+          <m:d>
+            <m:dPr>
+              <m:begChr m:val="["/>
+              <m:endChr m:val="]"/>
+            </m:dPr>
+            <m:e>
+              <m:m>
+                <m:mPr>
+                  <m:mcs>
+                    <m:mc>
+                      <m:mcPr>
+                        <m:count m:val="1"/>
+                        <m:mcJc m:val="left"/>
+                      </m:mcPr>
+                    </m:mc>
+                    <m:mc>
+                      <m:mcPr>
+                        <m:count m:val="1"/>
+                        <m:mcJc m:val="right"/>
+                      </m:mcPr>
+                    </m:mc>
+                  </m:mcs>
+                </m:mPr>
+                <m:mr>
+                  <m:e>
+                    <m:r>
+                      <w:rPr>
+                        <w:rFonts w:ascii="Cambria Math" w:hAnsi="Cambria Math"/>
+                      </w:rPr>
+                      <m:t xml:space="preserve">1</m:t>
+                    </m:r>
+                  </m:e>
+                  <m:e>
+                    <m:r>
+                      <w:rPr>
+                        <w:rFonts w:ascii="Cambria Math" w:hAnsi="Cambria Math"/>
+                      </w:rPr>
+                      <m:t xml:space="preserve">120</m:t>
+                    </m:r>
+                  </m:e>
+                </m:mr>
+                <m:mr>
+                  <m:e>
+                    <m:r>
+                      <w:rPr>
+                        <w:rFonts w:ascii="Cambria Math" w:hAnsi="Cambria Math"/>
+                      </w:rPr>
+                      <m:t xml:space="preserve">15</m:t>
+                    </m:r>
+                  </m:e>
+                  <m:e>
+                    <m:r>
+                      <w:rPr>
+                        <w:rFonts w:ascii="Cambria Math" w:hAnsi="Cambria Math"/>
+                      </w:rPr>
+                      <m:t xml:space="preserve">8</m:t>
+                    </m:r>
+                  </m:e>
+                </m:mr>
+              </m:m>
+            </m:e>
+          </m:d>
+          <m:r>
+            <w:rPr>
+              <w:rFonts w:ascii="Cambria Math" w:hAnsi="Cambria Math"/>
+            </w:rPr>
+            <m:t xml:space="preserve">, </m:t>
+          </m:r>
+          <m:d>
+            <m:e>
+              <m:m>
+                <m:mPr>
+                  <m:mcs>
+                    <m:mc>
+                      <m:mcPr>
+                        <m:count m:val="2"/>
+                        <m:mcJc m:val="right"/>
+                      </m:mcPr>
+                    </m:mc>
+                  </m:mcs>
+                </m:mPr>
+                <m:mr>
+                  <m:e>
+                    <m:r>
+                      <w:rPr>
+                        <w:rFonts w:ascii="Cambria Math" w:hAnsi="Cambria Math"/>
+                      </w:rPr>
+                      <m:t xml:space="preserve">7</m:t>
+                    </m:r>
+                  </m:e>
+                  <m:e>
+                    <m:r>
+                      <w:rPr>
+                        <w:rFonts w:ascii="Cambria Math" w:hAnsi="Cambria Math"/>
+                      </w:rPr>
+                      <m:t xml:space="preserve">30</m:t>
+                    </m:r>
+                  </m:e>
+                </m:mr>
+                <m:mr>
+                  <m:e>
+                    <m:r>
+                      <w:rPr>
+                        <w:rFonts w:ascii="Cambria Math" w:hAnsi="Cambria Math"/>
+                      </w:rPr>
+                      <m:t xml:space="preserve">120</m:t>
+                    </m:r>
+                  </m:e>
+                  <m:e>
+                    <m:r>
+                      <w:rPr>
+                        <w:rFonts w:ascii="Cambria Math" w:hAnsi="Cambria Math"/>
+                      </w:rPr>
+                      <m:t xml:space="preserve">4</m:t>
+                    </m:r>
+                  </m:e>
+                </m:mr>
+              </m:m>
+            </m:e>
+          </m:d>
+        </m:oMath>
+      </m:oMathPara>
+    </w:p>
+    <w:p>
+      <w:r>
+        <w:t xml:space="preserve">A term boxed on its left and right only, one underlined by a box, one struck through, and a value in double brackets:</w:t>
+      </w:r>
+    </w:p>
+    <w:p>
+      <m:oMathPara>
+        <m:oMathParaPr>
+          <m:jc m:val="center"/>
+        </m:oMathParaPr>
+        <m:oMath>
+          <m:borderBox>
+            <m:borderBoxPr>
+              <m:hideTop m:val="1"/>
+              <m:hideBot m:val="1"/>
+            </m:borderBoxPr>
+            <m:e>
+              <m:r>
+                <w:rPr>
+                  <w:rFonts w:ascii="Cambria Math" w:hAnsi="Cambria Math"/>
+                </w:rPr>
+                <m:t xml:space="preserve">a+b</m:t>
+              </m:r>
+            </m:e>
+          </m:borderBox>
+          <m:r>
+            <w:rPr>
+              <w:rFonts w:ascii="Cambria Math" w:hAnsi="Cambria Math"/>
+            </w:rPr>
+            <m:t xml:space="preserve">, </m:t>
+          </m:r>
+          <m:borderBox>
+            <m:borderBoxPr>
+              <m:hideTop m:val="1"/>
+              <m:hideLeft m:val="1"/>
+              <m:hideRight m:val="1"/>
+            </m:borderBoxPr>
+            <m:e>
+              <m:r>
+                <w:rPr>
+                  <w:rFonts w:ascii="Cambria Math" w:hAnsi="Cambria Math"/>
+                </w:rPr>
+                <m:t xml:space="preserve">c</m:t>
+              </m:r>
+            </m:e>
+          </m:borderBox>
+          <m:r>
+            <w:rPr>
+              <w:rFonts w:ascii="Cambria Math" w:hAnsi="Cambria Math"/>
+            </w:rPr>
+            <m:t xml:space="preserve">, </m:t>
+          </m:r>
+          <m:borderBox>
+            <m:borderBoxPr>
+              <m:hideTop m:val="1"/>
+              <m:hideBot m:val="1"/>
+              <m:hideLeft m:val="1"/>
+              <m:hideRight m:val="1"/>
+              <m:strikeH m:val="1"/>
+            </m:borderBoxPr>
+            <m:e>
+              <m:r>
+                <w:rPr>
+                  <w:rFonts w:ascii="Cambria Math" w:hAnsi="Cambria Math"/>
+                </w:rPr>
+                <m:t xml:space="preserve">d</m:t>
+              </m:r>
+            </m:e>
+          </m:borderBox>
+          <m:r>
+            <w:rPr>
+              <w:rFonts w:ascii="Cambria Math" w:hAnsi="Cambria Math"/>
+            </w:rPr>
+            <m:t xml:space="preserve">, </m:t>
+          </m:r>
+          <m:d>
+            <m:dPr>
+              <m:begChr m:val="⟦"/>
+              <m:endChr m:val="⟧"/>
+            </m:dPr>
+            <m:e>
+              <m:r>
+                <w:rPr>
+                  <w:rFonts w:ascii="Cambria Math" w:hAnsi="Cambria Math"/>
+                </w:rPr>
+                <m:t xml:space="preserve">x+1</m:t>
+              </m:r>
+            </m:e>
+          </m:d>
+        </m:oMath>
+      </m:oMathPara>
+    </w:p>
+    <w:p>
+      <w:r>
+        <w:t xml:space="preserve">An equation written with another prefix for its namespace:</w:t>
+      </w:r>
+    </w:p>
+    <w:p>
+      <q:oMathPara xmlns:q="http://schemas.openxmlformats.org/officeDocument/2006/math">
+        <q:oMath>
+          <q:sSup>
+            <q:e>
+              <q:r>
+                <q:t>r</q:t>
+              </q:r>
+            </q:e>
+            <q:sup>
+              <q:r>
+                <q:t>2</q:t>
+              </q:r>
+            </q:sup>
+          </q:sSup>
+          <q:r>
+            <q:t>=4</q:t>
+          </q:r>
+        </q:oMath>
+      </q:oMathPara>
+    </w:p>
+    <w:p>
+      <w:r>
         <w:t xml:space="preserve">Treasurers check every equation against the printed report.</w:t>
       </w:r>
     </w:p>

</xml_diff>